<commit_message>
Polish career package for applications
</commit_message>
<xml_diff>
--- a/docs/generated/karthik_ats_resume.docx
+++ b/docs/generated/karthik_ats_resume.docx
@@ -14,7 +14,7 @@
           <w:color w:val="111827"/>
           <w:sz w:val="40"/>
         </w:rPr>
-        <w:t>Karthick</w:t>
+        <w:t>Deepan Karthick</w:t>
       </w:r>
     </w:p>
     <w:p>
@@ -44,7 +44,7 @@
           <w:color w:val="4B5563"/>
           <w:sz w:val="17"/>
         </w:rPr>
-        <w:t>deepankarthick212@gmail.com | 9487572163 | Coimbatore, Tamil Nadu, India | GitHub: https://github.com/darkraigamer212-cmd | LinkedIn: https://www.linkedin.com/in/darkrai-gamer-166735374 | Portfolio: https://darkraigamer212-cmd.github.io/career-application-kit/portfolio/</w:t>
+        <w:t>deepankarthick212@gmail.com | 9487572163 | Coimbatore, Tamil Nadu, India | GitHub: https://github.com/darkraigamer212-cmd/career-application-kit | LinkedIn: https://www.linkedin.com/in/deepan-karthick-166735374/ | Portfolio: https://darkraigamer212-cmd.github.io/career-application-kit/portfolio/</w:t>
       </w:r>
     </w:p>
     <w:p>
@@ -328,7 +328,7 @@
           <w:color w:val="111827"/>
           <w:sz w:val="20"/>
         </w:rPr>
-        <w:t>- B.Sc. Computer Science with Artificial Intelligence, Rathinam Global, Coimbatore - 2028</w:t>
+        <w:t>- B.Sc. Computer Science with Artificial Intelligence, Rathinam Global University, Coimbatore - 2028</w:t>
       </w:r>
     </w:p>
     <w:p>

</xml_diff>

<commit_message>
Upgrade portfolio to cyberpunk React experience
</commit_message>
<xml_diff>
--- a/docs/generated/karthik_ats_resume.docx
+++ b/docs/generated/karthik_ats_resume.docx
@@ -88,7 +88,7 @@
           <w:color w:val="111827"/>
           <w:sz w:val="20"/>
         </w:rPr>
-        <w:t>- Languages: Python, JavaScript, HTML, CSS</w:t>
+        <w:t>- Languages: Python, JavaScript, HTML, CSS, TypeScript basics</w:t>
       </w:r>
     </w:p>
     <w:p>
@@ -102,7 +102,7 @@
           <w:color w:val="111827"/>
           <w:sz w:val="20"/>
         </w:rPr>
-        <w:t>- Frameworks and libraries: React, Vite, Supabase, Django basics, ReportLab, python-docx</w:t>
+        <w:t>- Frameworks and libraries: React, Vite, Supabase, Django basics, ReportLab, python-docx, GSAP basics, Framer Motion basics</w:t>
       </w:r>
     </w:p>
     <w:p>
@@ -116,7 +116,7 @@
           <w:color w:val="111827"/>
           <w:sz w:val="20"/>
         </w:rPr>
-        <w:t>- Tools: Git, GitHub, GitHub Actions, VS Code, Codex, ChatGPT, CLI tools, AI-assisted development</w:t>
+        <w:t>- Tools: Git, GitHub, GitHub Actions, VS Code, Codex, ChatGPT, CLI tools, AI-assisted development, Docker basics</w:t>
       </w:r>
     </w:p>
     <w:p>

</xml_diff>

<commit_message>
Upgrade portfolio trust story and resumes
</commit_message>
<xml_diff>
--- a/docs/generated/karthik_ats_resume.docx
+++ b/docs/generated/karthik_ats_resume.docx
@@ -66,7 +66,7 @@
           <w:color w:val="111827"/>
           <w:sz w:val="20"/>
         </w:rPr>
-        <w:t>Computer Science with Artificial Intelligence student with hands-on experience building Python automation tools, React business applications, ERP-style dashboards, and PDF/DOCX report generators. Seeking remote internships, part-time roles, freelance projects, or contract work involving AI automation, React, Python, internal tools, and practical business software.</w:t>
+        <w:t>Computer Science with Artificial Intelligence student building Python automation tools, React dashboards, ERP-style workflows, and PDF/DOCX report generators. Strongest proof: rental research automation with filtering/scoring logic, offline sample data, generated reports, and unit tests.</w:t>
       </w:r>
     </w:p>
     <w:p>
@@ -102,7 +102,7 @@
           <w:color w:val="111827"/>
           <w:sz w:val="20"/>
         </w:rPr>
-        <w:t>- Frameworks and libraries: React, Vite, Supabase, Django basics, ReportLab, python-docx, GSAP basics, Framer Motion basics</w:t>
+        <w:t>- Frontend and data: React, Vite, Supabase, ReportLab, python-docx, Django basics</w:t>
       </w:r>
     </w:p>
     <w:p>
@@ -116,21 +116,7 @@
           <w:color w:val="111827"/>
           <w:sz w:val="20"/>
         </w:rPr>
-        <w:t>- Tools: Git, GitHub, GitHub Actions, VS Code, Codex, ChatGPT, CLI tools, AI-assisted development, Docker basics</w:t>
-      </w:r>
-    </w:p>
-    <w:p>
-      <w:pPr>
-        <w:spacing w:after="40"/>
-        <w:ind w:left="317" w:hanging="173"/>
-      </w:pPr>
-      <w:r>
-        <w:rPr>
-          <w:rFonts w:ascii="Arial" w:hAnsi="Arial" w:eastAsia="Arial"/>
-          <w:color w:val="111827"/>
-          <w:sz w:val="20"/>
-        </w:rPr>
-        <w:t>- Technical areas: REST APIs, PostgreSQL, ERP development, dashboard development, responsive web design, UI/UX design, automation, PDF/DOCX generation, prompt engineering, basic testing, CI/CD basics, technical documentation</w:t>
+        <w:t>- Tools and areas: Git, GitHub, GitHub Actions, VS Code, CLI tools, AI-assisted development with manual verification, REST API basics, PostgreSQL basics, ERP workflows, dashboards, testing, documentation, Docker basics, GSAP basics, Framer Motion basics</w:t>
       </w:r>
     </w:p>
     <w:p>
@@ -166,7 +152,7 @@
           <w:color w:val="111827"/>
           <w:sz w:val="20"/>
         </w:rPr>
-        <w:t>- Built a Python automation tool that collects public rental listing data and converts it into a ranked housing decision report.</w:t>
+        <w:t>- Built a Python automation workflow that normalizes rental listing data, filters unsuitable options, ranks matches, and generates PDF/DOCX decision reports.</w:t>
       </w:r>
     </w:p>
     <w:p>
@@ -180,7 +166,7 @@
           <w:color w:val="111827"/>
           <w:sz w:val="20"/>
         </w:rPr>
-        <w:t>- Implemented filters for rent range, listing type, commute distance, furnishing, deposit, and unsuitable categories such as PGs, hostels, and shared rooms.</w:t>
+        <w:t>- Implemented scoring/filters for rent range, listing type, commute distance, furnishing, deposit practicality, and unsuitable categories.</w:t>
       </w:r>
     </w:p>
     <w:p>
@@ -194,7 +180,21 @@
           <w:color w:val="111827"/>
           <w:sz w:val="20"/>
         </w:rPr>
-        <w:t>- Generated English and Tamil PDF/DOCX reports with ranked properties, monthly budget, first-month setup cost, verification checklist, and source links.</w:t>
+        <w:t>- Generated English/Tamil outputs with ranked properties, budgets, verification checklist, source links, offline sample data, and unit tests.</w:t>
+      </w:r>
+    </w:p>
+    <w:p>
+      <w:pPr>
+        <w:spacing w:after="60" w:line="259" w:lineRule="auto"/>
+      </w:pPr>
+      <w:r>
+        <w:rPr>
+          <w:rFonts w:ascii="Arial" w:hAnsi="Arial" w:eastAsia="Arial"/>
+          <w:b/>
+          <w:color w:val="111827"/>
+          <w:sz w:val="20"/>
+        </w:rPr>
+        <w:t>Printing Press ERP / Business Management System | React, Supabase, JavaScript, Vite</w:t>
       </w:r>
     </w:p>
     <w:p>
@@ -208,7 +208,21 @@
           <w:color w:val="111827"/>
           <w:sz w:val="20"/>
         </w:rPr>
-        <w:t>- Used structured JSON output so reports can be regenerated and extended across multiple formats.</w:t>
+        <w:t>- Built and deployed React/Supabase business software screens for printing press workflows, dashboards, and operational tracking.</w:t>
+      </w:r>
+    </w:p>
+    <w:p>
+      <w:pPr>
+        <w:spacing w:after="40"/>
+        <w:ind w:left="317" w:hanging="173"/>
+      </w:pPr>
+      <w:r>
+        <w:rPr>
+          <w:rFonts w:ascii="Arial" w:hAnsi="Arial" w:eastAsia="Arial"/>
+          <w:color w:val="111827"/>
+          <w:sz w:val="20"/>
+        </w:rPr>
+        <w:t>- Modeled local-business workflows including inventory, production tracking, order operations, and role-based access concepts.</w:t>
       </w:r>
     </w:p>
     <w:p>
@@ -222,7 +236,7 @@
           <w:color w:val="111827"/>
           <w:sz w:val="20"/>
         </w:rPr>
-        <w:t>Portfolio Website | HTML, CSS, JavaScript</w:t>
+        <w:t>Portfolio Website | React, Vite, Framer Motion, GSAP</w:t>
       </w:r>
     </w:p>
     <w:p>
@@ -236,77 +250,7 @@
           <w:color w:val="111827"/>
           <w:sz w:val="20"/>
         </w:rPr>
-        <w:t>- Created a clean developer portfolio for internships, freelance work, and part-time developer roles.</w:t>
-      </w:r>
-    </w:p>
-    <w:p>
-      <w:pPr>
-        <w:spacing w:after="40"/>
-        <w:ind w:left="317" w:hanging="173"/>
-      </w:pPr>
-      <w:r>
-        <w:rPr>
-          <w:rFonts w:ascii="Arial" w:hAnsi="Arial" w:eastAsia="Arial"/>
-          <w:color w:val="111827"/>
-          <w:sz w:val="20"/>
-        </w:rPr>
-        <w:t>- Highlighted project proof, skills, resume links, and contact actions in a recruiter-friendly layout.</w:t>
-      </w:r>
-    </w:p>
-    <w:p>
-      <w:pPr>
-        <w:spacing w:after="60" w:line="259" w:lineRule="auto"/>
-      </w:pPr>
-      <w:r>
-        <w:rPr>
-          <w:rFonts w:ascii="Arial" w:hAnsi="Arial" w:eastAsia="Arial"/>
-          <w:b/>
-          <w:color w:val="111827"/>
-          <w:sz w:val="20"/>
-        </w:rPr>
-        <w:t>Printing Press ERP / Business Management System | React, business workflows</w:t>
-      </w:r>
-    </w:p>
-    <w:p>
-      <w:pPr>
-        <w:spacing w:after="40"/>
-        <w:ind w:left="317" w:hanging="173"/>
-      </w:pPr>
-      <w:r>
-        <w:rPr>
-          <w:rFonts w:ascii="Arial" w:hAnsi="Arial" w:eastAsia="Arial"/>
-          <w:color w:val="111827"/>
-          <w:sz w:val="20"/>
-        </w:rPr>
-        <w:t>- Built and deployed a business management system for printing press workflows, dashboards, and operational tracking.</w:t>
-      </w:r>
-    </w:p>
-    <w:p>
-      <w:pPr>
-        <w:spacing w:after="60" w:line="259" w:lineRule="auto"/>
-      </w:pPr>
-      <w:r>
-        <w:rPr>
-          <w:rFonts w:ascii="Arial" w:hAnsi="Arial" w:eastAsia="Arial"/>
-          <w:b/>
-          <w:color w:val="111827"/>
-          <w:sz w:val="20"/>
-        </w:rPr>
-        <w:t>Timber Calculator | Web app</w:t>
-      </w:r>
-    </w:p>
-    <w:p>
-      <w:pPr>
-        <w:spacing w:after="40"/>
-        <w:ind w:left="317" w:hanging="173"/>
-      </w:pPr>
-      <w:r>
-        <w:rPr>
-          <w:rFonts w:ascii="Arial" w:hAnsi="Arial" w:eastAsia="Arial"/>
-          <w:color w:val="111827"/>
-          <w:sz w:val="20"/>
-        </w:rPr>
-        <w:t>- Built a practical calculator for timber-related measurements and quick estimates.</w:t>
+        <w:t>- Created a public developer portfolio and one-tap links page with project proof, resume links, GitHub, LinkedIn, live demos, and contact actions.</w:t>
       </w:r>
     </w:p>
     <w:p>
@@ -364,7 +308,7 @@
           <w:color w:val="111827"/>
           <w:sz w:val="20"/>
         </w:rPr>
-        <w:t>- Availability: Remote internships, freelance work, part-time developer roles</w:t>
+        <w:t>- Availability: Immediate; remote internships, freelance work, part-time developer roles, contract projects around college schedule</w:t>
       </w:r>
     </w:p>
     <w:p>

</xml_diff>